<commit_message>
RMD fixed + Limor integrated
</commit_message>
<xml_diff>
--- a/9_figures/output/Table1.docx
+++ b/9_figures/output/Table1.docx
@@ -25,7 +25,7 @@
         <w:ind w:left="60" w:right="60" w:firstLine="0" w:firstLineChars="0"/>
       </w:pPr>
       <w:r>
-        <w:t xml:space="preserve">Table 1. Average Gini Coefficients for Households and Clans, 1969–2023</w:t>
+        <w:t xml:space="preserve">Table 1. Differences in Inequality by Race</w:t>
       </w:r>
     </w:p>
     <w:tbl xmlns:a="http://schemas.openxmlformats.org/drawingml/2006/main" xmlns:pic="http://schemas.openxmlformats.org/drawingml/2006/picture">
@@ -35,14 +35,17 @@
         <w:tblLook w:firstRow="1" w:lastRow="0" w:firstColumn="0" w:lastColumn="0" w:noHBand="0" w:noVBand="1"/>
       </w:tblPr>
       <w:tblGrid>
-        <w:gridCol w:w="1067"/>
-        <w:gridCol w:w="1784"/>
+        <w:gridCol w:w="1384"/>
         <w:gridCol w:w="1539"/>
-        <w:gridCol w:w="1584"/>
+        <w:gridCol w:w="1771"/>
+        <w:gridCol w:w="1744"/>
+        <w:gridCol w:w="2011"/>
+        <w:gridCol w:w="2318"/>
+        <w:gridCol w:w="2291"/>
       </w:tblGrid>
       <w:tr>
         <w:trPr>
-          <w:trHeight w:val="591" w:hRule="auto"/>
+          <w:trHeight w:val="635" w:hRule="auto"/>
           <w:tblHeader/>
         </w:trPr>
         header1
@@ -94,7 +97,7 @@
                 <w:szCs w:val="24"/>
                 <w:color w:val="000000"/>
               </w:rPr>
-              <w:t xml:space="preserve">Unit</w:t>
+              <w:t xml:space="preserve">Measure</w:t>
             </w:r>
           </w:p>
         </w:tc>
@@ -146,7 +149,7 @@
                 <w:szCs w:val="24"/>
                 <w:color w:val="000000"/>
               </w:rPr>
-              <w:t xml:space="preserve">Households</w:t>
+              <w:t xml:space="preserve">Black HH</w:t>
             </w:r>
           </w:p>
         </w:tc>
@@ -198,7 +201,7 @@
                 <w:szCs w:val="24"/>
                 <w:color w:val="000000"/>
               </w:rPr>
-              <w:t xml:space="preserve">Clans</w:t>
+              <w:t xml:space="preserve">Black Clans</w:t>
             </w:r>
           </w:p>
         </w:tc>
@@ -250,7 +253,163 @@
                 <w:szCs w:val="24"/>
                 <w:color w:val="000000"/>
               </w:rPr>
-              <w:t xml:space="preserve">Difference</w:t>
+              <w:t xml:space="preserve">Diff. (Black)</w:t>
+            </w:r>
+          </w:p>
+        </w:tc>
+        <w:tc>
+          <w:tcPr>
+            <w:tcBorders>
+              <w:bottom w:val="single" w:sz="12" w:space="0" w:color="666666"/>
+              <w:top w:val="single" w:sz="12" w:space="0" w:color="666666"/>
+              <w:left w:val="none" w:sz="0" w:space="0" w:color="000000"/>
+              <w:right w:val="none" w:sz="0" w:space="0" w:color="000000"/>
+            </w:tcBorders>
+            <w:shd w:val="clear" w:color="auto" w:fill="FFFFFF"/>
+            <w:tcMar>
+              <w:top w:w="0" w:type="dxa"/>
+              <w:bottom w:w="0" w:type="dxa"/>
+              <w:left w:w="0" w:type="dxa"/>
+              <w:right w:w="0" w:type="dxa"/>
+            </w:tcMar>
+            <w:vAlign w:val="center"/>
+          </w:tcPr>
+          <w:p>
+            <w:pPr>
+              <w:jc w:val="center"/>
+              <w:pBdr>
+                <w:bottom w:val="none" w:sz="0" w:space="0" w:color="000000"/>
+                <w:top w:val="none" w:sz="0" w:space="0" w:color="000000"/>
+                <w:left w:val="none" w:sz="0" w:space="0" w:color="000000"/>
+                <w:right w:val="none" w:sz="0" w:space="0" w:color="000000"/>
+              </w:pBdr>
+              <w:spacing w:after="100" w:before="100" w:line="240"/>
+              <w:ind w:left="100" w:right="100" w:firstLine="0" w:firstLineChars="0"/>
+              <w:rPr>
+                <w:rFonts w:ascii="Helvetica" w:hAnsi="Helvetica" w:eastAsia="Helvetica" w:cs="Helvetica"/>
+                <w:i w:val="false"/>
+                <w:b w:val="true"/>
+                <w:u w:val="none"/>
+                <w:sz w:val="24"/>
+                <w:szCs w:val="24"/>
+                <w:color w:val="000000"/>
+              </w:rPr>
+            </w:pPr>
+            <w:r>
+              <w:rPr>
+                <w:rFonts w:ascii="Helvetica" w:hAnsi="Helvetica" w:eastAsia="Helvetica" w:cs="Helvetica"/>
+                <w:i w:val="false"/>
+                <w:b w:val="true"/>
+                <w:u w:val="none"/>
+                <w:sz w:val="24"/>
+                <w:szCs w:val="24"/>
+                <w:color w:val="000000"/>
+              </w:rPr>
+              <w:t xml:space="preserve">Non-Black HH</w:t>
+            </w:r>
+          </w:p>
+        </w:tc>
+        <w:tc>
+          <w:tcPr>
+            <w:tcBorders>
+              <w:bottom w:val="single" w:sz="12" w:space="0" w:color="666666"/>
+              <w:top w:val="single" w:sz="12" w:space="0" w:color="666666"/>
+              <w:left w:val="none" w:sz="0" w:space="0" w:color="000000"/>
+              <w:right w:val="none" w:sz="0" w:space="0" w:color="000000"/>
+            </w:tcBorders>
+            <w:shd w:val="clear" w:color="auto" w:fill="FFFFFF"/>
+            <w:tcMar>
+              <w:top w:w="0" w:type="dxa"/>
+              <w:bottom w:w="0" w:type="dxa"/>
+              <w:left w:w="0" w:type="dxa"/>
+              <w:right w:w="0" w:type="dxa"/>
+            </w:tcMar>
+            <w:vAlign w:val="center"/>
+          </w:tcPr>
+          <w:p>
+            <w:pPr>
+              <w:jc w:val="center"/>
+              <w:pBdr>
+                <w:bottom w:val="none" w:sz="0" w:space="0" w:color="000000"/>
+                <w:top w:val="none" w:sz="0" w:space="0" w:color="000000"/>
+                <w:left w:val="none" w:sz="0" w:space="0" w:color="000000"/>
+                <w:right w:val="none" w:sz="0" w:space="0" w:color="000000"/>
+              </w:pBdr>
+              <w:spacing w:after="100" w:before="100" w:line="240"/>
+              <w:ind w:left="100" w:right="100" w:firstLine="0" w:firstLineChars="0"/>
+              <w:rPr>
+                <w:rFonts w:ascii="Helvetica" w:hAnsi="Helvetica" w:eastAsia="Helvetica" w:cs="Helvetica"/>
+                <w:i w:val="false"/>
+                <w:b w:val="true"/>
+                <w:u w:val="none"/>
+                <w:sz w:val="24"/>
+                <w:szCs w:val="24"/>
+                <w:color w:val="000000"/>
+              </w:rPr>
+            </w:pPr>
+            <w:r>
+              <w:rPr>
+                <w:rFonts w:ascii="Helvetica" w:hAnsi="Helvetica" w:eastAsia="Helvetica" w:cs="Helvetica"/>
+                <w:i w:val="false"/>
+                <w:b w:val="true"/>
+                <w:u w:val="none"/>
+                <w:sz w:val="24"/>
+                <w:szCs w:val="24"/>
+                <w:color w:val="000000"/>
+              </w:rPr>
+              <w:t xml:space="preserve">Non-Black Clans</w:t>
+            </w:r>
+          </w:p>
+        </w:tc>
+        <w:tc>
+          <w:tcPr>
+            <w:tcBorders>
+              <w:bottom w:val="single" w:sz="12" w:space="0" w:color="666666"/>
+              <w:top w:val="single" w:sz="12" w:space="0" w:color="666666"/>
+              <w:left w:val="none" w:sz="0" w:space="0" w:color="000000"/>
+              <w:right w:val="none" w:sz="0" w:space="0" w:color="000000"/>
+            </w:tcBorders>
+            <w:shd w:val="clear" w:color="auto" w:fill="FFFFFF"/>
+            <w:tcMar>
+              <w:top w:w="0" w:type="dxa"/>
+              <w:bottom w:w="0" w:type="dxa"/>
+              <w:left w:w="0" w:type="dxa"/>
+              <w:right w:w="0" w:type="dxa"/>
+            </w:tcMar>
+            <w:vAlign w:val="center"/>
+          </w:tcPr>
+          <w:p>
+            <w:pPr>
+              <w:jc w:val="center"/>
+              <w:pBdr>
+                <w:bottom w:val="none" w:sz="0" w:space="0" w:color="000000"/>
+                <w:top w:val="none" w:sz="0" w:space="0" w:color="000000"/>
+                <w:left w:val="none" w:sz="0" w:space="0" w:color="000000"/>
+                <w:right w:val="none" w:sz="0" w:space="0" w:color="000000"/>
+              </w:pBdr>
+              <w:spacing w:after="100" w:before="100" w:line="240"/>
+              <w:ind w:left="100" w:right="100" w:firstLine="0" w:firstLineChars="0"/>
+              <w:rPr>
+                <w:rFonts w:ascii="Helvetica" w:hAnsi="Helvetica" w:eastAsia="Helvetica" w:cs="Helvetica"/>
+                <w:i w:val="false"/>
+                <w:b w:val="true"/>
+                <w:u w:val="none"/>
+                <w:sz w:val="24"/>
+                <w:szCs w:val="24"/>
+                <w:color w:val="000000"/>
+              </w:rPr>
+            </w:pPr>
+            <w:r>
+              <w:rPr>
+                <w:rFonts w:ascii="Helvetica" w:hAnsi="Helvetica" w:eastAsia="Helvetica" w:cs="Helvetica"/>
+                <w:i w:val="false"/>
+                <w:b w:val="true"/>
+                <w:u w:val="none"/>
+                <w:sz w:val="24"/>
+                <w:szCs w:val="24"/>
+                <w:color w:val="000000"/>
+              </w:rPr>
+              <w:t xml:space="preserve">Diff. (Non-Black)</w:t>
             </w:r>
           </w:p>
         </w:tc>
@@ -360,7 +519,7 @@
                 <w:szCs w:val="20"/>
                 <w:color w:val="000000"/>
               </w:rPr>
-              <w:t xml:space="preserve">0.432</w:t>
+              <w:t xml:space="preserve">0.444</w:t>
             </w:r>
             <w:r>
               <w:rPr>
@@ -384,7 +543,7 @@
                 <w:szCs w:val="20"/>
                 <w:color w:val="000000"/>
               </w:rPr>
-              <w:t xml:space="preserve">(SE = 0.008)</w:t>
+              <w:t xml:space="preserve">(SE = 0.013)</w:t>
             </w:r>
           </w:p>
         </w:tc>
@@ -436,7 +595,7 @@
                 <w:szCs w:val="20"/>
                 <w:color w:val="000000"/>
               </w:rPr>
-              <w:t xml:space="preserve">0.370</w:t>
+              <w:t xml:space="preserve">0.376</w:t>
             </w:r>
             <w:r>
               <w:rPr>
@@ -460,7 +619,7 @@
                 <w:szCs w:val="20"/>
                 <w:color w:val="000000"/>
               </w:rPr>
-              <w:t xml:space="preserve">(SE = 0.009)</w:t>
+              <w:t xml:space="preserve">(SE = 0.020)</w:t>
             </w:r>
           </w:p>
         </w:tc>
@@ -512,7 +671,7 @@
                 <w:szCs w:val="20"/>
                 <w:color w:val="000000"/>
               </w:rPr>
-              <w:t xml:space="preserve">0.062</w:t>
+              <w:t xml:space="preserve">0.068</w:t>
             </w:r>
             <w:r>
               <w:rPr>
@@ -536,7 +695,235 @@
                 <w:szCs w:val="20"/>
                 <w:color w:val="000000"/>
               </w:rPr>
-              <w:t xml:space="preserve">(SE = 0.012)</w:t>
+              <w:t xml:space="preserve">(SE = 0.024)</w:t>
+            </w:r>
+          </w:p>
+        </w:tc>
+        <w:tc>
+          <w:tcPr>
+            <w:tcBorders>
+              <w:bottom w:val="single" w:sz="6" w:space="0" w:color="666666"/>
+              <w:top w:val="single" w:sz="12" w:space="0" w:color="666666"/>
+              <w:left w:val="none" w:sz="0" w:space="0" w:color="000000"/>
+              <w:right w:val="none" w:sz="0" w:space="0" w:color="000000"/>
+            </w:tcBorders>
+            <w:shd w:val="clear" w:color="auto" w:fill="FFFFFF"/>
+            <w:tcMar>
+              <w:top w:w="0" w:type="dxa"/>
+              <w:bottom w:w="0" w:type="dxa"/>
+              <w:left w:w="0" w:type="dxa"/>
+              <w:right w:w="0" w:type="dxa"/>
+            </w:tcMar>
+            <w:vAlign w:val="center"/>
+          </w:tcPr>
+          <w:p>
+            <w:pPr>
+              <w:jc w:val="center"/>
+              <w:pBdr>
+                <w:bottom w:val="none" w:sz="0" w:space="0" w:color="000000"/>
+                <w:top w:val="none" w:sz="0" w:space="0" w:color="000000"/>
+                <w:left w:val="none" w:sz="0" w:space="0" w:color="000000"/>
+                <w:right w:val="none" w:sz="0" w:space="0" w:color="000000"/>
+              </w:pBdr>
+              <w:spacing w:after="100" w:before="100" w:line="240"/>
+              <w:ind w:left="100" w:right="100" w:firstLine="0" w:firstLineChars="0"/>
+              <w:rPr>
+                <w:rFonts w:ascii="Helvetica" w:hAnsi="Helvetica" w:eastAsia="Helvetica" w:cs="Helvetica"/>
+                <w:i w:val="false"/>
+                <w:b w:val="false"/>
+                <w:u w:val="none"/>
+                <w:sz w:val="20"/>
+                <w:szCs w:val="20"/>
+                <w:color w:val="000000"/>
+              </w:rPr>
+            </w:pPr>
+            <w:r>
+              <w:rPr>
+                <w:rFonts w:ascii="Helvetica" w:hAnsi="Helvetica" w:eastAsia="Helvetica" w:cs="Helvetica"/>
+                <w:i w:val="false"/>
+                <w:b w:val="false"/>
+                <w:u w:val="none"/>
+                <w:sz w:val="20"/>
+                <w:szCs w:val="20"/>
+                <w:color w:val="000000"/>
+              </w:rPr>
+              <w:t xml:space="preserve">0.420</w:t>
+            </w:r>
+            <w:r>
+              <w:rPr>
+                <w:rFonts w:ascii="Helvetica" w:hAnsi="Helvetica" w:eastAsia="Helvetica" w:cs="Helvetica"/>
+                <w:i w:val="false"/>
+                <w:b w:val="false"/>
+                <w:u w:val="none"/>
+                <w:sz w:val="20"/>
+                <w:szCs w:val="20"/>
+                <w:color w:val="000000"/>
+              </w:rPr>
+              <w:br/>
+            </w:r>
+            <w:r>
+              <w:rPr>
+                <w:rFonts w:ascii="Helvetica" w:hAnsi="Helvetica" w:eastAsia="Helvetica" w:cs="Helvetica"/>
+                <w:i w:val="false"/>
+                <w:b w:val="false"/>
+                <w:u w:val="none"/>
+                <w:sz w:val="20"/>
+                <w:szCs w:val="20"/>
+                <w:color w:val="000000"/>
+              </w:rPr>
+              <w:t xml:space="preserve">(SE = 0.009)</w:t>
+            </w:r>
+          </w:p>
+        </w:tc>
+        <w:tc>
+          <w:tcPr>
+            <w:tcBorders>
+              <w:bottom w:val="single" w:sz="6" w:space="0" w:color="666666"/>
+              <w:top w:val="single" w:sz="12" w:space="0" w:color="666666"/>
+              <w:left w:val="none" w:sz="0" w:space="0" w:color="000000"/>
+              <w:right w:val="none" w:sz="0" w:space="0" w:color="000000"/>
+            </w:tcBorders>
+            <w:shd w:val="clear" w:color="auto" w:fill="FFFFFF"/>
+            <w:tcMar>
+              <w:top w:w="0" w:type="dxa"/>
+              <w:bottom w:w="0" w:type="dxa"/>
+              <w:left w:w="0" w:type="dxa"/>
+              <w:right w:w="0" w:type="dxa"/>
+            </w:tcMar>
+            <w:vAlign w:val="center"/>
+          </w:tcPr>
+          <w:p>
+            <w:pPr>
+              <w:jc w:val="center"/>
+              <w:pBdr>
+                <w:bottom w:val="none" w:sz="0" w:space="0" w:color="000000"/>
+                <w:top w:val="none" w:sz="0" w:space="0" w:color="000000"/>
+                <w:left w:val="none" w:sz="0" w:space="0" w:color="000000"/>
+                <w:right w:val="none" w:sz="0" w:space="0" w:color="000000"/>
+              </w:pBdr>
+              <w:spacing w:after="100" w:before="100" w:line="240"/>
+              <w:ind w:left="100" w:right="100" w:firstLine="0" w:firstLineChars="0"/>
+              <w:rPr>
+                <w:rFonts w:ascii="Helvetica" w:hAnsi="Helvetica" w:eastAsia="Helvetica" w:cs="Helvetica"/>
+                <w:i w:val="false"/>
+                <w:b w:val="false"/>
+                <w:u w:val="none"/>
+                <w:sz w:val="20"/>
+                <w:szCs w:val="20"/>
+                <w:color w:val="000000"/>
+              </w:rPr>
+            </w:pPr>
+            <w:r>
+              <w:rPr>
+                <w:rFonts w:ascii="Helvetica" w:hAnsi="Helvetica" w:eastAsia="Helvetica" w:cs="Helvetica"/>
+                <w:i w:val="false"/>
+                <w:b w:val="false"/>
+                <w:u w:val="none"/>
+                <w:sz w:val="20"/>
+                <w:szCs w:val="20"/>
+                <w:color w:val="000000"/>
+              </w:rPr>
+              <w:t xml:space="preserve">0.360</w:t>
+            </w:r>
+            <w:r>
+              <w:rPr>
+                <w:rFonts w:ascii="Helvetica" w:hAnsi="Helvetica" w:eastAsia="Helvetica" w:cs="Helvetica"/>
+                <w:i w:val="false"/>
+                <w:b w:val="false"/>
+                <w:u w:val="none"/>
+                <w:sz w:val="20"/>
+                <w:szCs w:val="20"/>
+                <w:color w:val="000000"/>
+              </w:rPr>
+              <w:br/>
+            </w:r>
+            <w:r>
+              <w:rPr>
+                <w:rFonts w:ascii="Helvetica" w:hAnsi="Helvetica" w:eastAsia="Helvetica" w:cs="Helvetica"/>
+                <w:i w:val="false"/>
+                <w:b w:val="false"/>
+                <w:u w:val="none"/>
+                <w:sz w:val="20"/>
+                <w:szCs w:val="20"/>
+                <w:color w:val="000000"/>
+              </w:rPr>
+              <w:t xml:space="preserve">(SE = 0.010)</w:t>
+            </w:r>
+          </w:p>
+        </w:tc>
+        <w:tc>
+          <w:tcPr>
+            <w:tcBorders>
+              <w:bottom w:val="single" w:sz="6" w:space="0" w:color="666666"/>
+              <w:top w:val="single" w:sz="12" w:space="0" w:color="666666"/>
+              <w:left w:val="none" w:sz="0" w:space="0" w:color="000000"/>
+              <w:right w:val="none" w:sz="0" w:space="0" w:color="000000"/>
+            </w:tcBorders>
+            <w:shd w:val="clear" w:color="auto" w:fill="FFFFFF"/>
+            <w:tcMar>
+              <w:top w:w="0" w:type="dxa"/>
+              <w:bottom w:w="0" w:type="dxa"/>
+              <w:left w:w="0" w:type="dxa"/>
+              <w:right w:w="0" w:type="dxa"/>
+            </w:tcMar>
+            <w:vAlign w:val="center"/>
+          </w:tcPr>
+          <w:p>
+            <w:pPr>
+              <w:jc w:val="center"/>
+              <w:pBdr>
+                <w:bottom w:val="none" w:sz="0" w:space="0" w:color="000000"/>
+                <w:top w:val="none" w:sz="0" w:space="0" w:color="000000"/>
+                <w:left w:val="none" w:sz="0" w:space="0" w:color="000000"/>
+                <w:right w:val="none" w:sz="0" w:space="0" w:color="000000"/>
+              </w:pBdr>
+              <w:spacing w:after="100" w:before="100" w:line="240"/>
+              <w:ind w:left="100" w:right="100" w:firstLine="0" w:firstLineChars="0"/>
+              <w:rPr>
+                <w:rFonts w:ascii="Helvetica" w:hAnsi="Helvetica" w:eastAsia="Helvetica" w:cs="Helvetica"/>
+                <w:i w:val="false"/>
+                <w:b w:val="false"/>
+                <w:u w:val="none"/>
+                <w:sz w:val="20"/>
+                <w:szCs w:val="20"/>
+                <w:color w:val="000000"/>
+              </w:rPr>
+            </w:pPr>
+            <w:r>
+              <w:rPr>
+                <w:rFonts w:ascii="Helvetica" w:hAnsi="Helvetica" w:eastAsia="Helvetica" w:cs="Helvetica"/>
+                <w:i w:val="false"/>
+                <w:b w:val="false"/>
+                <w:u w:val="none"/>
+                <w:sz w:val="20"/>
+                <w:szCs w:val="20"/>
+                <w:color w:val="000000"/>
+              </w:rPr>
+              <w:t xml:space="preserve">0.060</w:t>
+            </w:r>
+            <w:r>
+              <w:rPr>
+                <w:rFonts w:ascii="Helvetica" w:hAnsi="Helvetica" w:eastAsia="Helvetica" w:cs="Helvetica"/>
+                <w:i w:val="false"/>
+                <w:b w:val="false"/>
+                <w:u w:val="none"/>
+                <w:sz w:val="20"/>
+                <w:szCs w:val="20"/>
+                <w:color w:val="000000"/>
+              </w:rPr>
+              <w:br/>
+            </w:r>
+            <w:r>
+              <w:rPr>
+                <w:rFonts w:ascii="Helvetica" w:hAnsi="Helvetica" w:eastAsia="Helvetica" w:cs="Helvetica"/>
+                <w:i w:val="false"/>
+                <w:b w:val="false"/>
+                <w:u w:val="none"/>
+                <w:sz w:val="20"/>
+                <w:szCs w:val="20"/>
+                <w:color w:val="000000"/>
+              </w:rPr>
+              <w:t xml:space="preserve">(SE = 0.013)</w:t>
             </w:r>
           </w:p>
         </w:tc>
@@ -646,7 +1033,7 @@
                 <w:szCs w:val="20"/>
                 <w:color w:val="000000"/>
               </w:rPr>
-              <w:t xml:space="preserve">0.848</w:t>
+              <w:t xml:space="preserve">0.878</w:t>
             </w:r>
             <w:r>
               <w:rPr>
@@ -670,7 +1057,7 @@
                 <w:szCs w:val="20"/>
                 <w:color w:val="000000"/>
               </w:rPr>
-              <w:t xml:space="preserve">(SE = 0.011)</w:t>
+              <w:t xml:space="preserve">(SE = 0.016)</w:t>
             </w:r>
           </w:p>
         </w:tc>
@@ -722,7 +1109,7 @@
                 <w:szCs w:val="20"/>
                 <w:color w:val="000000"/>
               </w:rPr>
-              <w:t xml:space="preserve">0.728</w:t>
+              <w:t xml:space="preserve">0.740</w:t>
             </w:r>
             <w:r>
               <w:rPr>
@@ -746,7 +1133,7 @@
                 <w:szCs w:val="20"/>
                 <w:color w:val="000000"/>
               </w:rPr>
-              <w:t xml:space="preserve">(SE = 0.017)</w:t>
+              <w:t xml:space="preserve">(SE = 0.031)</w:t>
             </w:r>
           </w:p>
         </w:tc>
@@ -798,7 +1185,7 @@
                 <w:szCs w:val="20"/>
                 <w:color w:val="000000"/>
               </w:rPr>
-              <w:t xml:space="preserve">0.120</w:t>
+              <w:t xml:space="preserve">0.138</w:t>
             </w:r>
             <w:r>
               <w:rPr>
@@ -822,7 +1209,235 @@
                 <w:szCs w:val="20"/>
                 <w:color w:val="000000"/>
               </w:rPr>
-              <w:t xml:space="preserve">(SE = 0.020)</w:t>
+              <w:t xml:space="preserve">(SE = 0.035)</w:t>
+            </w:r>
+          </w:p>
+        </w:tc>
+        <w:tc>
+          <w:tcPr>
+            <w:tcBorders>
+              <w:bottom w:val="single" w:sz="12" w:space="0" w:color="666666"/>
+              <w:top w:val="single" w:sz="6" w:space="0" w:color="666666"/>
+              <w:left w:val="none" w:sz="0" w:space="0" w:color="000000"/>
+              <w:right w:val="none" w:sz="0" w:space="0" w:color="000000"/>
+            </w:tcBorders>
+            <w:shd w:val="clear" w:color="auto" w:fill="FFFFFF"/>
+            <w:tcMar>
+              <w:top w:w="0" w:type="dxa"/>
+              <w:bottom w:w="0" w:type="dxa"/>
+              <w:left w:w="0" w:type="dxa"/>
+              <w:right w:w="0" w:type="dxa"/>
+            </w:tcMar>
+            <w:vAlign w:val="center"/>
+          </w:tcPr>
+          <w:p>
+            <w:pPr>
+              <w:jc w:val="center"/>
+              <w:pBdr>
+                <w:bottom w:val="none" w:sz="0" w:space="0" w:color="000000"/>
+                <w:top w:val="none" w:sz="0" w:space="0" w:color="000000"/>
+                <w:left w:val="none" w:sz="0" w:space="0" w:color="000000"/>
+                <w:right w:val="none" w:sz="0" w:space="0" w:color="000000"/>
+              </w:pBdr>
+              <w:spacing w:after="100" w:before="100" w:line="240"/>
+              <w:ind w:left="100" w:right="100" w:firstLine="0" w:firstLineChars="0"/>
+              <w:rPr>
+                <w:rFonts w:ascii="Helvetica" w:hAnsi="Helvetica" w:eastAsia="Helvetica" w:cs="Helvetica"/>
+                <w:i w:val="false"/>
+                <w:b w:val="false"/>
+                <w:u w:val="none"/>
+                <w:sz w:val="20"/>
+                <w:szCs w:val="20"/>
+                <w:color w:val="000000"/>
+              </w:rPr>
+            </w:pPr>
+            <w:r>
+              <w:rPr>
+                <w:rFonts w:ascii="Helvetica" w:hAnsi="Helvetica" w:eastAsia="Helvetica" w:cs="Helvetica"/>
+                <w:i w:val="false"/>
+                <w:b w:val="false"/>
+                <w:u w:val="none"/>
+                <w:sz w:val="20"/>
+                <w:szCs w:val="20"/>
+                <w:color w:val="000000"/>
+              </w:rPr>
+              <w:t xml:space="preserve">0.833</w:t>
+            </w:r>
+            <w:r>
+              <w:rPr>
+                <w:rFonts w:ascii="Helvetica" w:hAnsi="Helvetica" w:eastAsia="Helvetica" w:cs="Helvetica"/>
+                <w:i w:val="false"/>
+                <w:b w:val="false"/>
+                <w:u w:val="none"/>
+                <w:sz w:val="20"/>
+                <w:szCs w:val="20"/>
+                <w:color w:val="000000"/>
+              </w:rPr>
+              <w:br/>
+            </w:r>
+            <w:r>
+              <w:rPr>
+                <w:rFonts w:ascii="Helvetica" w:hAnsi="Helvetica" w:eastAsia="Helvetica" w:cs="Helvetica"/>
+                <w:i w:val="false"/>
+                <w:b w:val="false"/>
+                <w:u w:val="none"/>
+                <w:sz w:val="20"/>
+                <w:szCs w:val="20"/>
+                <w:color w:val="000000"/>
+              </w:rPr>
+              <w:t xml:space="preserve">(SE = 0.012)</w:t>
+            </w:r>
+          </w:p>
+        </w:tc>
+        <w:tc>
+          <w:tcPr>
+            <w:tcBorders>
+              <w:bottom w:val="single" w:sz="12" w:space="0" w:color="666666"/>
+              <w:top w:val="single" w:sz="6" w:space="0" w:color="666666"/>
+              <w:left w:val="none" w:sz="0" w:space="0" w:color="000000"/>
+              <w:right w:val="none" w:sz="0" w:space="0" w:color="000000"/>
+            </w:tcBorders>
+            <w:shd w:val="clear" w:color="auto" w:fill="FFFFFF"/>
+            <w:tcMar>
+              <w:top w:w="0" w:type="dxa"/>
+              <w:bottom w:w="0" w:type="dxa"/>
+              <w:left w:w="0" w:type="dxa"/>
+              <w:right w:w="0" w:type="dxa"/>
+            </w:tcMar>
+            <w:vAlign w:val="center"/>
+          </w:tcPr>
+          <w:p>
+            <w:pPr>
+              <w:jc w:val="center"/>
+              <w:pBdr>
+                <w:bottom w:val="none" w:sz="0" w:space="0" w:color="000000"/>
+                <w:top w:val="none" w:sz="0" w:space="0" w:color="000000"/>
+                <w:left w:val="none" w:sz="0" w:space="0" w:color="000000"/>
+                <w:right w:val="none" w:sz="0" w:space="0" w:color="000000"/>
+              </w:pBdr>
+              <w:spacing w:after="100" w:before="100" w:line="240"/>
+              <w:ind w:left="100" w:right="100" w:firstLine="0" w:firstLineChars="0"/>
+              <w:rPr>
+                <w:rFonts w:ascii="Helvetica" w:hAnsi="Helvetica" w:eastAsia="Helvetica" w:cs="Helvetica"/>
+                <w:i w:val="false"/>
+                <w:b w:val="false"/>
+                <w:u w:val="none"/>
+                <w:sz w:val="20"/>
+                <w:szCs w:val="20"/>
+                <w:color w:val="000000"/>
+              </w:rPr>
+            </w:pPr>
+            <w:r>
+              <w:rPr>
+                <w:rFonts w:ascii="Helvetica" w:hAnsi="Helvetica" w:eastAsia="Helvetica" w:cs="Helvetica"/>
+                <w:i w:val="false"/>
+                <w:b w:val="false"/>
+                <w:u w:val="none"/>
+                <w:sz w:val="20"/>
+                <w:szCs w:val="20"/>
+                <w:color w:val="000000"/>
+              </w:rPr>
+              <w:t xml:space="preserve">0.709</w:t>
+            </w:r>
+            <w:r>
+              <w:rPr>
+                <w:rFonts w:ascii="Helvetica" w:hAnsi="Helvetica" w:eastAsia="Helvetica" w:cs="Helvetica"/>
+                <w:i w:val="false"/>
+                <w:b w:val="false"/>
+                <w:u w:val="none"/>
+                <w:sz w:val="20"/>
+                <w:szCs w:val="20"/>
+                <w:color w:val="000000"/>
+              </w:rPr>
+              <w:br/>
+            </w:r>
+            <w:r>
+              <w:rPr>
+                <w:rFonts w:ascii="Helvetica" w:hAnsi="Helvetica" w:eastAsia="Helvetica" w:cs="Helvetica"/>
+                <w:i w:val="false"/>
+                <w:b w:val="false"/>
+                <w:u w:val="none"/>
+                <w:sz w:val="20"/>
+                <w:szCs w:val="20"/>
+                <w:color w:val="000000"/>
+              </w:rPr>
+              <w:t xml:space="preserve">(SE = 0.019)</w:t>
+            </w:r>
+          </w:p>
+        </w:tc>
+        <w:tc>
+          <w:tcPr>
+            <w:tcBorders>
+              <w:bottom w:val="single" w:sz="12" w:space="0" w:color="666666"/>
+              <w:top w:val="single" w:sz="6" w:space="0" w:color="666666"/>
+              <w:left w:val="none" w:sz="0" w:space="0" w:color="000000"/>
+              <w:right w:val="none" w:sz="0" w:space="0" w:color="000000"/>
+            </w:tcBorders>
+            <w:shd w:val="clear" w:color="auto" w:fill="FFFFFF"/>
+            <w:tcMar>
+              <w:top w:w="0" w:type="dxa"/>
+              <w:bottom w:w="0" w:type="dxa"/>
+              <w:left w:w="0" w:type="dxa"/>
+              <w:right w:w="0" w:type="dxa"/>
+            </w:tcMar>
+            <w:vAlign w:val="center"/>
+          </w:tcPr>
+          <w:p>
+            <w:pPr>
+              <w:jc w:val="center"/>
+              <w:pBdr>
+                <w:bottom w:val="none" w:sz="0" w:space="0" w:color="000000"/>
+                <w:top w:val="none" w:sz="0" w:space="0" w:color="000000"/>
+                <w:left w:val="none" w:sz="0" w:space="0" w:color="000000"/>
+                <w:right w:val="none" w:sz="0" w:space="0" w:color="000000"/>
+              </w:pBdr>
+              <w:spacing w:after="100" w:before="100" w:line="240"/>
+              <w:ind w:left="100" w:right="100" w:firstLine="0" w:firstLineChars="0"/>
+              <w:rPr>
+                <w:rFonts w:ascii="Helvetica" w:hAnsi="Helvetica" w:eastAsia="Helvetica" w:cs="Helvetica"/>
+                <w:i w:val="false"/>
+                <w:b w:val="false"/>
+                <w:u w:val="none"/>
+                <w:sz w:val="20"/>
+                <w:szCs w:val="20"/>
+                <w:color w:val="000000"/>
+              </w:rPr>
+            </w:pPr>
+            <w:r>
+              <w:rPr>
+                <w:rFonts w:ascii="Helvetica" w:hAnsi="Helvetica" w:eastAsia="Helvetica" w:cs="Helvetica"/>
+                <w:i w:val="false"/>
+                <w:b w:val="false"/>
+                <w:u w:val="none"/>
+                <w:sz w:val="20"/>
+                <w:szCs w:val="20"/>
+                <w:color w:val="000000"/>
+              </w:rPr>
+              <w:t xml:space="preserve">0.124</w:t>
+            </w:r>
+            <w:r>
+              <w:rPr>
+                <w:rFonts w:ascii="Helvetica" w:hAnsi="Helvetica" w:eastAsia="Helvetica" w:cs="Helvetica"/>
+                <w:i w:val="false"/>
+                <w:b w:val="false"/>
+                <w:u w:val="none"/>
+                <w:sz w:val="20"/>
+                <w:szCs w:val="20"/>
+                <w:color w:val="000000"/>
+              </w:rPr>
+              <w:br/>
+            </w:r>
+            <w:r>
+              <w:rPr>
+                <w:rFonts w:ascii="Helvetica" w:hAnsi="Helvetica" w:eastAsia="Helvetica" w:cs="Helvetica"/>
+                <w:i w:val="false"/>
+                <w:b w:val="false"/>
+                <w:u w:val="none"/>
+                <w:sz w:val="20"/>
+                <w:szCs w:val="20"/>
+                <w:color w:val="000000"/>
+              </w:rPr>
+              <w:t xml:space="preserve">(SE = 0.022)</w:t>
             </w:r>
           </w:p>
         </w:tc>
@@ -851,7 +1466,7 @@
           <w:szCs w:val="24"/>
           <w:color w:val="000000"/>
         </w:rPr>
-        <w:t xml:space="preserve">Note: Gini coefficients reported are averages across all years. Income data were collected annually until 1997, and biennially thereafter. Wealth data were collected every five years from 1984 to 1999, and every other year thereafter. Both income and wealth are adjusted for inflation. Wealth is measured excluding home equity. Standard errors are shown in parentheses. Income estimates use 242,200 household-years and 64,292 clan-years, with 2,906 unique clans. Wealth estimates use 113,579 household-years and 25,045 clan-years, with 2,622 unique clans.</w:t>
+        <w:t xml:space="preserve">Note: Gini coefficients reported are averages across all years using weighted data. Income data were collected annually until 1997, and biennially thereafter. Wealth data were collected every five years from 1984 to 1999, and every other year thereafter. Both income and wealth are adjusted for inflation. Wealth is measured excluding home equity. Standard errors are shown in parentheses. Income estimates use 91,775 Black household-years and 22,213 Black clan-years, and 148,336 Non-Black household-years and 42,079 Non-Black clan-years, with 2,906 unique clans in total; 966 clans ever classified as Black and 2,003 clans ever classified as Non-Black, including 63 clans appearing in both groups across years. Wealth estimates use 46,059 Black household-years and 8,608 Black clan-years, and 74,813 Non-Black household-years and 18,047 Non-Black clan-years, with 2,636 unique clans in total; 827 clans ever classified as Black and 1,853 clans ever classified as Non-Black, including 44 clans appearing in both groups across years.</w:t>
       </w:r>
     </w:p>
     <w:sectPr>

</xml_diff>

<commit_message>
Wealth includes home equity in main text
</commit_message>
<xml_diff>
--- a/9_figures/output/Table1.docx
+++ b/9_figures/output/Table1.docx
@@ -1033,7 +1033,7 @@
                 <w:szCs w:val="20"/>
                 <w:color w:val="000000"/>
               </w:rPr>
-              <w:t xml:space="preserve">0.878</w:t>
+              <w:t xml:space="preserve">0.928</w:t>
             </w:r>
             <w:r>
               <w:rPr>
@@ -1057,7 +1057,7 @@
                 <w:szCs w:val="20"/>
                 <w:color w:val="000000"/>
               </w:rPr>
-              <w:t xml:space="preserve">(SE = 0.016)</w:t>
+              <w:t xml:space="preserve">(SE = 0.030)</w:t>
             </w:r>
           </w:p>
         </w:tc>
@@ -1109,7 +1109,7 @@
                 <w:szCs w:val="20"/>
                 <w:color w:val="000000"/>
               </w:rPr>
-              <w:t xml:space="preserve">0.740</w:t>
+              <w:t xml:space="preserve">0.683</w:t>
             </w:r>
             <w:r>
               <w:rPr>
@@ -1133,7 +1133,7 @@
                 <w:szCs w:val="20"/>
                 <w:color w:val="000000"/>
               </w:rPr>
-              <w:t xml:space="preserve">(SE = 0.031)</w:t>
+              <w:t xml:space="preserve">(SE = 0.038)</w:t>
             </w:r>
           </w:p>
         </w:tc>
@@ -1185,7 +1185,7 @@
                 <w:szCs w:val="20"/>
                 <w:color w:val="000000"/>
               </w:rPr>
-              <w:t xml:space="preserve">0.138</w:t>
+              <w:t xml:space="preserve">0.245</w:t>
             </w:r>
             <w:r>
               <w:rPr>
@@ -1209,7 +1209,7 @@
                 <w:szCs w:val="20"/>
                 <w:color w:val="000000"/>
               </w:rPr>
-              <w:t xml:space="preserve">(SE = 0.035)</w:t>
+              <w:t xml:space="preserve">(SE = 0.048)</w:t>
             </w:r>
           </w:p>
         </w:tc>
@@ -1261,7 +1261,7 @@
                 <w:szCs w:val="20"/>
                 <w:color w:val="000000"/>
               </w:rPr>
-              <w:t xml:space="preserve">0.833</w:t>
+              <w:t xml:space="preserve">0.781</w:t>
             </w:r>
             <w:r>
               <w:rPr>
@@ -1285,7 +1285,7 @@
                 <w:szCs w:val="20"/>
                 <w:color w:val="000000"/>
               </w:rPr>
-              <w:t xml:space="preserve">(SE = 0.012)</w:t>
+              <w:t xml:space="preserve">(SE = 0.013)</w:t>
             </w:r>
           </w:p>
         </w:tc>
@@ -1337,7 +1337,7 @@
                 <w:szCs w:val="20"/>
                 <w:color w:val="000000"/>
               </w:rPr>
-              <w:t xml:space="preserve">0.709</w:t>
+              <w:t xml:space="preserve">0.645</w:t>
             </w:r>
             <w:r>
               <w:rPr>
@@ -1413,7 +1413,7 @@
                 <w:szCs w:val="20"/>
                 <w:color w:val="000000"/>
               </w:rPr>
-              <w:t xml:space="preserve">0.124</w:t>
+              <w:t xml:space="preserve">0.136</w:t>
             </w:r>
             <w:r>
               <w:rPr>
@@ -1437,7 +1437,7 @@
                 <w:szCs w:val="20"/>
                 <w:color w:val="000000"/>
               </w:rPr>
-              <w:t xml:space="preserve">(SE = 0.022)</w:t>
+              <w:t xml:space="preserve">(SE = 0.023)</w:t>
             </w:r>
           </w:p>
         </w:tc>
@@ -1466,7 +1466,7 @@
           <w:szCs w:val="24"/>
           <w:color w:val="000000"/>
         </w:rPr>
-        <w:t xml:space="preserve">Note: Gini coefficients reported are averages across all years using weighted data. Income data were collected annually until 1997, and biennially thereafter. Wealth data were collected every five years from 1984 to 1999, and every other year thereafter. Both income and wealth are adjusted for inflation. Wealth is measured excluding home equity. Standard errors are shown in parentheses. Income estimates use 91,775 Black household-years and 22,213 Black clan-years, and 148,336 Non-Black household-years and 42,079 Non-Black clan-years, with 2,906 unique clans in total; 966 clans ever classified as Black and 2,003 clans ever classified as Non-Black, including 63 clans appearing in both groups across years. Wealth estimates use 46,059 Black household-years and 8,608 Black clan-years, and 74,813 Non-Black household-years and 18,047 Non-Black clan-years, with 2,636 unique clans in total; 827 clans ever classified as Black and 1,853 clans ever classified as Non-Black, including 44 clans appearing in both groups across years.</w:t>
+        <w:t xml:space="preserve">Note: Gini coefficients reported are averages across all years using weighted data. Income data were collected annually until 1997, and biennially thereafter. Wealth data were collected every five years from 1984 to 1999, and every other year thereafter. Both income and wealth are adjusted for inflation. Wealth is measured including home equity. Standard errors are shown in parentheses. Income estimates use 91,775 Black household-years and 22,213 Black clan-years, and 148,336 Non-Black household-years and 42,079 Non-Black clan-years, with 2,906 unique clans in total; 966 clans ever classified as Black and 2,003 clans ever classified as Non-Black, including 63 clans appearing in both groups across years. Wealth estimates use 46,059 Black household-years and 8,608 Black clan-years, and 74,813 Non-Black household-years and 18,047 Non-Black clan-years, with 2,636 unique clans in total; 827 clans ever classified as Black and 1,853 clans ever classified as Non-Black, including 44 clans appearing in both groups across years.</w:t>
       </w:r>
     </w:p>
     <w:sectPr>

</xml_diff>